<commit_message>
Set resume location to Raleigh, NC.
Use 6507 Glendower Rd, Raleigh, NC 27613 in the header, list Cisco
as Raleigh, NC, and drop the Denver / United States work locations.

Co-authored-by: chchilds <chchilds@users.noreply.github.com>
</commit_message>
<xml_diff>
--- a/Resume - Chris Childs 2026 (v14).docx
+++ b/Resume - Chris Childs 2026 (v14).docx
@@ -50,7 +50,7 @@
           <w:color w:val="222222"/>
           <w:sz w:val="21"/>
         </w:rPr>
-        <w:t>2632 Gross Ave, Wake Forest, North Carolina 27587  ·  (919) 523-8426</w:t>
+        <w:t>6507 Glendower Rd, Raleigh, North Carolina 27613  ·  (919) 523-8426</w:t>
       </w:r>
     </w:p>
     <w:p>
@@ -148,7 +148,7 @@
           <w:color w:val="222222"/>
           <w:sz w:val="21"/>
         </w:rPr>
-        <w:t>Customer-focused Cisco combined seller and solutions engineer with 14+ years at Cisco spanning premium services, strategic software, Enterprise Agreements, and pre-sales architecture. Designs consumption models that attach CX Enterprise Agreements (CXEA), Expert Care, Lifecycle Services, and Advanced Services to software ELAs — and converts that design work into competitive wins across security, collaboration, data center, wireless, and enterprise networking.</w:t>
+        <w:t>Customer-focused Cisco combined seller and solutions engineer based in Raleigh, North Carolina, with 14+ years at Cisco spanning premium services, strategic software, Enterprise Agreements, and pre-sales architecture. Designs consumption models that attach CX Enterprise Agreements (CXEA), Expert Care, Lifecycle Services, and Advanced Services to software ELAs — and converts that design work into competitive wins across security, collaboration, data center, wireless, and enterprise networking.</w:t>
       </w:r>
     </w:p>
     <w:p>
@@ -194,7 +194,7 @@
           <w:color w:val="444444"/>
           <w:sz w:val="21"/>
         </w:rPr>
-        <w:t xml:space="preserve">  |  RTP, NC  ·  Denver, CO  ·  United States</w:t>
+        <w:t xml:space="preserve">  |  Raleigh, NC</w:t>
       </w:r>
     </w:p>
     <w:p>

</xml_diff>

<commit_message>
Mark Cisco certifications valid through December 2026.
Move CCNP R&S, CCDP, CCNP Data Center, and CCNA Voice out of
previously-held status and list them as current.

Co-authored-by: chchilds <chchilds@users.noreply.github.com>
</commit_message>
<xml_diff>
--- a/Resume - Chris Childs 2026 (v14).docx
+++ b/Resume - Chris Childs 2026 (v14).docx
@@ -821,7 +821,33 @@
           <w:color w:val="1B365D"/>
           <w:sz w:val="21"/>
         </w:rPr>
-        <w:t xml:space="preserve">Current / recent:  </w:t>
+        <w:t xml:space="preserve">Cisco certifications (valid through December 2026):  </w:t>
+      </w:r>
+      <w:r>
+        <w:rPr>
+          <w:rFonts w:ascii="Calibri" w:hAnsi="Calibri" w:eastAsia="Calibri"/>
+          <w:b w:val="0"/>
+          <w:i w:val="0"/>
+          <w:color w:val="222222"/>
+          <w:sz w:val="21"/>
+        </w:rPr>
+        <w:t>CCNP Routing &amp; Switching; CCDP Design; CCNP Data Center; CCNA Voice.</w:t>
+      </w:r>
+    </w:p>
+    <w:p>
+      <w:pPr>
+        <w:widowControl/>
+        <w:spacing w:before="20" w:after="20" w:lineRule="exact" w:line="280"/>
+      </w:pPr>
+      <w:r>
+        <w:rPr>
+          <w:rFonts w:ascii="Calibri" w:hAnsi="Calibri" w:eastAsia="Calibri"/>
+          <w:b/>
+          <w:i w:val="0"/>
+          <w:color w:val="1B365D"/>
+          <w:sz w:val="21"/>
+        </w:rPr>
+        <w:t xml:space="preserve">Sales enablement:  </w:t>
       </w:r>
       <w:r>
         <w:rPr>
@@ -847,7 +873,7 @@
           <w:color w:val="1B365D"/>
           <w:sz w:val="21"/>
         </w:rPr>
-        <w:t xml:space="preserve">Previously held:  </w:t>
+        <w:t xml:space="preserve">Additional:  </w:t>
       </w:r>
       <w:r>
         <w:rPr>
@@ -857,7 +883,7 @@
           <w:color w:val="222222"/>
           <w:sz w:val="21"/>
         </w:rPr>
-        <w:t>CCNP Routing &amp; Switching, CCDP Design, CCNP Data Center, CCNA Voice (valid through 2020); VCP 6.0 DCV (valid through 2018); CCIE Data Center written passed (lab date Nov 2017).</w:t>
+        <w:t>CCIE Data Center written passed (lab date Nov 2017); VCP 6.0 DCV.</w:t>
       </w:r>
     </w:p>
     <w:p>

</xml_diff>